<commit_message>
5 out of 10 phases of documentation complete. Some rearrangement of document files.
</commit_message>
<xml_diff>
--- a/Tests/ManualTestChecklist.docx
+++ b/Tests/ManualTestChecklist.docx
@@ -5261,7 +5261,7 @@
         <w:t xml:space="preserve"> </w:t>
       </w:r>
       <w:r>
-        <w:t xml:space="preserve">App with a visible peak at a known frequency (e.g. 500 Hz).</w:t>
+        <w:t xml:space="preserve">App with a visible peak at a known frequency (e.g. 200 Hz).</w:t>
       </w:r>
     </w:p>
     <w:p>
@@ -5272,7 +5272,7 @@
         </w:numPr>
       </w:pPr>
       <w:r>
-        <w:t xml:space="preserve">Position the cursor exactly over the 500 Hz peak</w:t>
+        <w:t xml:space="preserve">Position the cursor exactly over the 200 Hz peak</w:t>
       </w:r>
     </w:p>
     <w:p>
@@ -5310,7 +5310,7 @@
         </w:numPr>
       </w:pPr>
       <w:r>
-        <w:t xml:space="preserve">Verify the 500 Hz peak remains under the cursor as the axes zoom in</w:t>
+        <w:t xml:space="preserve">Verify the 200 Hz peak remains under the cursor as the axes zoom in</w:t>
       </w:r>
     </w:p>
     <w:p>
@@ -5358,13 +5358,13 @@
       </w:r>
     </w:p>
     <w:bookmarkEnd w:id="41"/>
-    <w:bookmarkStart w:id="42" w:name="c18-double-tap-resets-axes"/>
+    <w:bookmarkStart w:id="42" w:name="X4dfa7b4ef895023cb4f1e5b3751154ceced1ceb"/>
     <w:p>
       <w:pPr>
         <w:pStyle w:val="Heading3"/>
       </w:pPr>
       <w:r>
-        <w:t xml:space="preserve">C18 — Double-tap resets axes</w:t>
+        <w:t xml:space="preserve">C18 — Reset axes to defaults (macOS/iOS/iPadOS)</w:t>
       </w:r>
     </w:p>
     <w:p>
@@ -5382,7 +5382,7 @@
         <w:t xml:space="preserve"> </w:t>
       </w:r>
       <w:r>
-        <w:t xml:space="preserve">iOS · iPadOS</w:t>
+        <w:t xml:space="preserve">macOS · iOS · iPadOS</w:t>
       </w:r>
       <w:r>
         <w:t xml:space="preserve"> </w:t>
@@ -5421,31 +5421,106 @@
     </w:p>
     <w:p>
       <w:pPr>
+        <w:pStyle w:val="BodyText"/>
+      </w:pPr>
+      <w:r>
+        <w:rPr>
+          <w:b/>
+          <w:bCs/>
+        </w:rPr>
+        <w:t xml:space="preserve">macOS:</w:t>
+      </w:r>
+      <w:r>
+        <w:t xml:space="preserve"> </w:t>
+      </w:r>
+      <w:r>
+        <w:t xml:space="preserve">- [ ] Right-click the chart area to open the context menu</w:t>
+      </w:r>
+      <w:r>
+        <w:t xml:space="preserve"> </w:t>
+      </w:r>
+      <w:r>
+        <w:t xml:space="preserve">- [ ] Select</w:t>
+      </w:r>
+      <w:r>
+        <w:t xml:space="preserve"> </w:t>
+      </w:r>
+      <w:r>
+        <w:rPr>
+          <w:b/>
+          <w:bCs/>
+        </w:rPr>
+        <w:t xml:space="preserve">Reset Axes to Defaults</w:t>
+      </w:r>
+      <w:r>
+        <w:t xml:space="preserve"> </w:t>
+      </w:r>
+      <w:r>
+        <w:t xml:space="preserve">- [ ] Verify both axes return to the saved default values (as stored in Settings)</w:t>
+      </w:r>
+    </w:p>
+    <w:p>
+      <w:pPr>
+        <w:pStyle w:val="BodyText"/>
+      </w:pPr>
+      <w:r>
+        <w:rPr>
+          <w:b/>
+          <w:bCs/>
+        </w:rPr>
+        <w:t xml:space="preserve">iOS/iPadOS:</w:t>
+      </w:r>
+      <w:r>
+        <w:t xml:space="preserve"> </w:t>
+      </w:r>
+      <w:r>
+        <w:t xml:space="preserve">- [ ] Tap the</w:t>
+      </w:r>
+      <w:r>
+        <w:t xml:space="preserve"> </w:t>
+      </w:r>
+      <w:r>
+        <w:rPr>
+          <w:b/>
+          <w:bCs/>
+        </w:rPr>
+        <w:t xml:space="preserve">info icon</w:t>
+      </w:r>
+      <w:r>
+        <w:t xml:space="preserve"> </w:t>
+      </w:r>
+      <w:r>
+        <w:t xml:space="preserve">on the chart</w:t>
+      </w:r>
+      <w:r>
+        <w:t xml:space="preserve"> </w:t>
+      </w:r>
+      <w:r>
+        <w:t xml:space="preserve">- [ ] Tap</w:t>
+      </w:r>
+      <w:r>
+        <w:t xml:space="preserve"> </w:t>
+      </w:r>
+      <w:r>
+        <w:rPr>
+          <w:b/>
+          <w:bCs/>
+        </w:rPr>
+        <w:t xml:space="preserve">Reset Axes to Defaults</w:t>
+      </w:r>
+      <w:r>
+        <w:t xml:space="preserve"> </w:t>
+      </w:r>
+      <w:r>
+        <w:t xml:space="preserve">- [ ] Verify both axes return to the saved default values (as stored in Settings)</w:t>
+      </w:r>
+    </w:p>
+    <w:p>
+      <w:pPr>
+        <w:pStyle w:val="Compact"/>
         <w:numPr>
           <w:ilvl w:val="0"/>
           <w:numId w:val="1152"/>
-        </w:numPr>
-      </w:pPr>
-      <w:r>
-        <w:t xml:space="preserve">Double-tap the chart area</w:t>
-      </w:r>
-    </w:p>
-    <w:p>
-      <w:pPr>
-        <w:numPr>
-          <w:ilvl w:val="0"/>
-          <w:numId w:val="1153"/>
-        </w:numPr>
-      </w:pPr>
-      <w:r>
-        <w:t xml:space="preserve">Verify both axes return to the saved default values (as stored in Settings)</w:t>
-      </w:r>
-    </w:p>
-    <w:p>
-      <w:pPr>
-        <w:numPr>
-          <w:ilvl w:val="0"/>
-          <w:numId w:val="1154"/>
         </w:numPr>
       </w:pPr>
       <w:r>
@@ -5486,13 +5561,13 @@
       </w:r>
     </w:p>
     <w:bookmarkEnd w:id="42"/>
-    <w:bookmarkStart w:id="43" w:name="X7eb6cb66af7e8e865c8b13ce53be50e9e03875f"/>
+    <w:bookmarkStart w:id="43" w:name="X07febf3046a4eadeef66f8b0bc927acea565ae0"/>
     <w:p>
       <w:pPr>
         <w:pStyle w:val="Heading3"/>
       </w:pPr>
       <w:r>
-        <w:t xml:space="preserve">C19 — Log/linear scale toggle preserved on restart</w:t>
+        <w:t xml:space="preserve">C19 — Settings axis ranges preserved on restart</w:t>
       </w:r>
     </w:p>
     <w:p>
@@ -5551,11 +5626,33 @@
       <w:pPr>
         <w:numPr>
           <w:ilvl w:val="0"/>
+          <w:numId w:val="1153"/>
+        </w:numPr>
+      </w:pPr>
+      <w:r>
+        <w:t xml:space="preserve">Open Settings and set non-default values for Min Frequency, Max Frequency, Min dB, and Max dB (e.g. 100–500 Hz, −100 to −20 dB)</w:t>
+      </w:r>
+    </w:p>
+    <w:p>
+      <w:pPr>
+        <w:numPr>
+          <w:ilvl w:val="0"/>
+          <w:numId w:val="1154"/>
+        </w:numPr>
+      </w:pPr>
+      <w:r>
+        <w:t xml:space="preserve">Close Settings and confirm the chart reflects the new ranges</w:t>
+      </w:r>
+    </w:p>
+    <w:p>
+      <w:pPr>
+        <w:numPr>
+          <w:ilvl w:val="0"/>
           <w:numId w:val="1155"/>
         </w:numPr>
       </w:pPr>
       <w:r>
-        <w:t xml:space="preserve">Tap the log/linear scale toggle to change it from its current state</w:t>
+        <w:t xml:space="preserve">Quit the app fully (swipe up on iOS/iPadOS; Cmd+Q on macOS)</w:t>
       </w:r>
     </w:p>
     <w:p>
@@ -5566,7 +5663,7 @@
         </w:numPr>
       </w:pPr>
       <w:r>
-        <w:t xml:space="preserve">Note the new state</w:t>
+        <w:t xml:space="preserve">Relaunch GuitarTap</w:t>
       </w:r>
     </w:p>
     <w:p>
@@ -5577,7 +5674,7 @@
         </w:numPr>
       </w:pPr>
       <w:r>
-        <w:t xml:space="preserve">Quit the app fully (swipe up on iOS/iPadOS; Cmd+Q on macOS)</w:t>
+        <w:t xml:space="preserve">Verify the chart opens with the frequency and dB ranges set in Settings</w:t>
       </w:r>
     </w:p>
     <w:p>
@@ -5588,7 +5685,7 @@
         </w:numPr>
       </w:pPr>
       <w:r>
-        <w:t xml:space="preserve">Relaunch GuitarTap</w:t>
+        <w:t xml:space="preserve">Note: gesture-based pan/zoom is intentionally not persisted and will revert to Settings values on restart</w:t>
       </w:r>
     </w:p>
     <w:p>
@@ -5596,28 +5693,6 @@
         <w:numPr>
           <w:ilvl w:val="0"/>
           <w:numId w:val="1159"/>
-        </w:numPr>
-      </w:pPr>
-      <w:r>
-        <w:t xml:space="preserve">Verify the scale toggle is in the same state as when the app was quit</w:t>
-      </w:r>
-    </w:p>
-    <w:p>
-      <w:pPr>
-        <w:numPr>
-          <w:ilvl w:val="0"/>
-          <w:numId w:val="1160"/>
-        </w:numPr>
-      </w:pPr>
-      <w:r>
-        <w:t xml:space="preserve">Confirm the chart renders using that scale immediately on launch</w:t>
-      </w:r>
-    </w:p>
-    <w:p>
-      <w:pPr>
-        <w:numPr>
-          <w:ilvl w:val="0"/>
-          <w:numId w:val="1161"/>
         </w:numPr>
       </w:pPr>
       <w:r>
@@ -5733,11 +5808,33 @@
       <w:pPr>
         <w:numPr>
           <w:ilvl w:val="0"/>
+          <w:numId w:val="1160"/>
+        </w:numPr>
+      </w:pPr>
+      <w:r>
+        <w:t xml:space="preserve">Press and drag (iOS/iPadOS) or click-and-drag (macOS) a peak label</w:t>
+      </w:r>
+    </w:p>
+    <w:p>
+      <w:pPr>
+        <w:numPr>
+          <w:ilvl w:val="0"/>
+          <w:numId w:val="1161"/>
+        </w:numPr>
+      </w:pPr>
+      <w:r>
+        <w:t xml:space="preserve">Drag it to a new position</w:t>
+      </w:r>
+    </w:p>
+    <w:p>
+      <w:pPr>
+        <w:numPr>
+          <w:ilvl w:val="0"/>
           <w:numId w:val="1162"/>
         </w:numPr>
       </w:pPr>
       <w:r>
-        <w:t xml:space="preserve">Long-press (iOS/iPadOS) or click-and-drag (macOS) a peak label</w:t>
+        <w:t xml:space="preserve">Release</w:t>
       </w:r>
     </w:p>
     <w:p>
@@ -5748,7 +5845,7 @@
         </w:numPr>
       </w:pPr>
       <w:r>
-        <w:t xml:space="preserve">Drag it to a new position</w:t>
+        <w:t xml:space="preserve">Verify the label is at the new position and stays there</w:t>
       </w:r>
     </w:p>
     <w:p>
@@ -5756,28 +5853,6 @@
         <w:numPr>
           <w:ilvl w:val="0"/>
           <w:numId w:val="1164"/>
-        </w:numPr>
-      </w:pPr>
-      <w:r>
-        <w:t xml:space="preserve">Release</w:t>
-      </w:r>
-    </w:p>
-    <w:p>
-      <w:pPr>
-        <w:numPr>
-          <w:ilvl w:val="0"/>
-          <w:numId w:val="1165"/>
-        </w:numPr>
-      </w:pPr>
-      <w:r>
-        <w:t xml:space="preserve">Verify the label is at the new position and stays there</w:t>
-      </w:r>
-    </w:p>
-    <w:p>
-      <w:pPr>
-        <w:numPr>
-          <w:ilvl w:val="0"/>
-          <w:numId w:val="1166"/>
         </w:numPr>
       </w:pPr>
       <w:r>
@@ -5883,11 +5958,33 @@
       <w:pPr>
         <w:numPr>
           <w:ilvl w:val="0"/>
+          <w:numId w:val="1165"/>
+        </w:numPr>
+      </w:pPr>
+      <w:r>
+        <w:t xml:space="preserve">Pinch to zoom (iOS/iPadOS) or scroll with Command/Option/Control modifier (macOS) to zoom the chart</w:t>
+      </w:r>
+    </w:p>
+    <w:p>
+      <w:pPr>
+        <w:numPr>
+          <w:ilvl w:val="0"/>
+          <w:numId w:val="1166"/>
+        </w:numPr>
+      </w:pPr>
+      <w:r>
+        <w:t xml:space="preserve">Pan the chart</w:t>
+      </w:r>
+    </w:p>
+    <w:p>
+      <w:pPr>
+        <w:numPr>
+          <w:ilvl w:val="0"/>
           <w:numId w:val="1167"/>
         </w:numPr>
       </w:pPr>
       <w:r>
-        <w:t xml:space="preserve">Pinch/scroll to zoom the chart</w:t>
+        <w:t xml:space="preserve">Verify the annotation label stays attached to its peak at the correct chart position</w:t>
       </w:r>
     </w:p>
     <w:p>
@@ -5898,7 +5995,7 @@
         </w:numPr>
       </w:pPr>
       <w:r>
-        <w:t xml:space="preserve">Pan the chart</w:t>
+        <w:t xml:space="preserve">Confirm the label does not jump back to the default position</w:t>
       </w:r>
     </w:p>
     <w:p>
@@ -5906,28 +6003,6 @@
         <w:numPr>
           <w:ilvl w:val="0"/>
           <w:numId w:val="1169"/>
-        </w:numPr>
-      </w:pPr>
-      <w:r>
-        <w:t xml:space="preserve">Verify the annotation label stays attached to its peak at the correct chart position</w:t>
-      </w:r>
-    </w:p>
-    <w:p>
-      <w:pPr>
-        <w:numPr>
-          <w:ilvl w:val="0"/>
-          <w:numId w:val="1170"/>
-        </w:numPr>
-      </w:pPr>
-      <w:r>
-        <w:t xml:space="preserve">Confirm the label does not jump back to the default position</w:t>
-      </w:r>
-    </w:p>
-    <w:p>
-      <w:pPr>
-        <w:numPr>
-          <w:ilvl w:val="0"/>
-          <w:numId w:val="1171"/>
         </w:numPr>
       </w:pPr>
       <w:r>
@@ -5968,13 +6043,13 @@
       </w:r>
     </w:p>
     <w:bookmarkEnd w:id="46"/>
-    <w:bookmarkStart w:id="47" w:name="X3ae02c660f95f86981f5a68069aeac94418e35f"/>
+    <w:bookmarkStart w:id="47" w:name="d13-annotation-reset-to-default-position"/>
     <w:p>
       <w:pPr>
         <w:pStyle w:val="Heading3"/>
       </w:pPr>
       <w:r>
-        <w:t xml:space="preserve">D13 — Double-tap annotation resets position</w:t>
+        <w:t xml:space="preserve">D13 — Annotation reset to default position</w:t>
       </w:r>
     </w:p>
     <w:p>
@@ -6033,29 +6108,35 @@
       <w:pPr>
         <w:numPr>
           <w:ilvl w:val="0"/>
+          <w:numId w:val="1170"/>
+        </w:numPr>
+      </w:pPr>
+      <w:r>
+        <w:t xml:space="preserve">iOS/iPadOS: Double-tap the label; macOS: right-click and choose</w:t>
+      </w:r>
+      <w:r>
+        <w:t xml:space="preserve"> </w:t>
+      </w:r>
+      <w:r>
+        <w:t xml:space="preserve">“Reset Position”</w:t>
+      </w:r>
+    </w:p>
+    <w:p>
+      <w:pPr>
+        <w:numPr>
+          <w:ilvl w:val="0"/>
+          <w:numId w:val="1171"/>
+        </w:numPr>
+      </w:pPr>
+      <w:r>
+        <w:t xml:space="preserve">Verify the label snaps back to its default (zero-offset) position relative to the peak marker</w:t>
+      </w:r>
+    </w:p>
+    <w:p>
+      <w:pPr>
+        <w:numPr>
+          <w:ilvl w:val="0"/>
           <w:numId w:val="1172"/>
-        </w:numPr>
-      </w:pPr>
-      <w:r>
-        <w:t xml:space="preserve">Double-tap the label</w:t>
-      </w:r>
-    </w:p>
-    <w:p>
-      <w:pPr>
-        <w:numPr>
-          <w:ilvl w:val="0"/>
-          <w:numId w:val="1173"/>
-        </w:numPr>
-      </w:pPr>
-      <w:r>
-        <w:t xml:space="preserve">Verify the label snaps back to its default (zero-offset) position relative to the peak marker</w:t>
-      </w:r>
-    </w:p>
-    <w:p>
-      <w:pPr>
-        <w:numPr>
-          <w:ilvl w:val="0"/>
-          <w:numId w:val="1174"/>
         </w:numPr>
       </w:pPr>
       <w:r>
@@ -6161,51 +6242,51 @@
       <w:pPr>
         <w:numPr>
           <w:ilvl w:val="0"/>
+          <w:numId w:val="1173"/>
+        </w:numPr>
+      </w:pPr>
+      <w:r>
+        <w:t xml:space="preserve">Tap the</w:t>
+      </w:r>
+      <w:r>
+        <w:t xml:space="preserve"> </w:t>
+      </w:r>
+      <w:r>
+        <w:rPr>
+          <w:b/>
+          <w:bCs/>
+        </w:rPr>
+        <w:t xml:space="preserve">Annotations</w:t>
+      </w:r>
+      <w:r>
+        <w:t xml:space="preserve"> </w:t>
+      </w:r>
+      <w:r>
+        <w:t xml:space="preserve">button until the icon/tooltip indicates</w:t>
+      </w:r>
+      <w:r>
+        <w:t xml:space="preserve"> </w:t>
+      </w:r>
+      <w:r>
+        <w:t xml:space="preserve">“None”</w:t>
+      </w:r>
+    </w:p>
+    <w:p>
+      <w:pPr>
+        <w:numPr>
+          <w:ilvl w:val="0"/>
+          <w:numId w:val="1174"/>
+        </w:numPr>
+      </w:pPr>
+      <w:r>
+        <w:t xml:space="preserve">Verify all peak annotation labels disappear from the chart</w:t>
+      </w:r>
+    </w:p>
+    <w:p>
+      <w:pPr>
+        <w:numPr>
+          <w:ilvl w:val="0"/>
           <w:numId w:val="1175"/>
-        </w:numPr>
-      </w:pPr>
-      <w:r>
-        <w:t xml:space="preserve">Tap the</w:t>
-      </w:r>
-      <w:r>
-        <w:t xml:space="preserve"> </w:t>
-      </w:r>
-      <w:r>
-        <w:rPr>
-          <w:b/>
-          <w:bCs/>
-        </w:rPr>
-        <w:t xml:space="preserve">Annotations</w:t>
-      </w:r>
-      <w:r>
-        <w:t xml:space="preserve"> </w:t>
-      </w:r>
-      <w:r>
-        <w:t xml:space="preserve">button until the icon/tooltip indicates</w:t>
-      </w:r>
-      <w:r>
-        <w:t xml:space="preserve"> </w:t>
-      </w:r>
-      <w:r>
-        <w:t xml:space="preserve">“None”</w:t>
-      </w:r>
-    </w:p>
-    <w:p>
-      <w:pPr>
-        <w:numPr>
-          <w:ilvl w:val="0"/>
-          <w:numId w:val="1176"/>
-        </w:numPr>
-      </w:pPr>
-      <w:r>
-        <w:t xml:space="preserve">Verify all peak annotation labels disappear from the chart</w:t>
-      </w:r>
-    </w:p>
-    <w:p>
-      <w:pPr>
-        <w:numPr>
-          <w:ilvl w:val="0"/>
-          <w:numId w:val="1177"/>
         </w:numPr>
       </w:pPr>
       <w:r>
@@ -6246,13 +6327,13 @@
       </w:r>
     </w:p>
     <w:bookmarkEnd w:id="48"/>
-    <w:bookmarkStart w:id="49" w:name="X110d7250b1c0c17f22266b5d1333bfdbda333df"/>
+    <w:bookmarkStart w:id="49" w:name="X988626b8ec4c05e4f0a95761fb071b9a2aaa6a4"/>
     <w:p>
       <w:pPr>
         <w:pStyle w:val="Heading3"/>
       </w:pPr>
       <w:r>
-        <w:t xml:space="preserve">D15 — Selected mode shows only tapped labels</w:t>
+        <w:t xml:space="preserve">D15 — Selected mode shows only Results-panel-selected labels</w:t>
       </w:r>
     </w:p>
     <w:p>
@@ -6304,7 +6385,45 @@
         <w:t xml:space="preserve"> </w:t>
       </w:r>
       <w:r>
-        <w:t xml:space="preserve">Multiple peaks are visible.</w:t>
+        <w:t xml:space="preserve">Multiple peaks are visible and at least one peak is not selected in the Results panel.</w:t>
+      </w:r>
+    </w:p>
+    <w:p>
+      <w:pPr>
+        <w:numPr>
+          <w:ilvl w:val="0"/>
+          <w:numId w:val="1176"/>
+        </w:numPr>
+      </w:pPr>
+      <w:r>
+        <w:t xml:space="preserve">In the Results panel, confirm some peaks are selected and some are not</w:t>
+      </w:r>
+    </w:p>
+    <w:p>
+      <w:pPr>
+        <w:numPr>
+          <w:ilvl w:val="0"/>
+          <w:numId w:val="1177"/>
+        </w:numPr>
+      </w:pPr>
+      <w:r>
+        <w:t xml:space="preserve">Cycle the Annotations button to the</w:t>
+      </w:r>
+      <w:r>
+        <w:t xml:space="preserve"> </w:t>
+      </w:r>
+      <w:r>
+        <w:rPr>
+          <w:b/>
+          <w:bCs/>
+        </w:rPr>
+        <w:t xml:space="preserve">Selected</w:t>
+      </w:r>
+      <w:r>
+        <w:t xml:space="preserve"> </w:t>
+      </w:r>
+      <w:r>
+        <w:t xml:space="preserve">mode</w:t>
       </w:r>
     </w:p>
     <w:p>
@@ -6315,23 +6434,7 @@
         </w:numPr>
       </w:pPr>
       <w:r>
-        <w:t xml:space="preserve">Cycle the Annotations button to the</w:t>
-      </w:r>
-      <w:r>
-        <w:t xml:space="preserve"> </w:t>
-      </w:r>
-      <w:r>
-        <w:rPr>
-          <w:b/>
-          <w:bCs/>
-        </w:rPr>
-        <w:t xml:space="preserve">Selected</w:t>
-      </w:r>
-      <w:r>
-        <w:t xml:space="preserve"> </w:t>
-      </w:r>
-      <w:r>
-        <w:t xml:space="preserve">mode</w:t>
+        <w:t xml:space="preserve">Verify only the labels for Results-panel-selected peaks are visible</w:t>
       </w:r>
     </w:p>
     <w:p>
@@ -6342,7 +6445,7 @@
         </w:numPr>
       </w:pPr>
       <w:r>
-        <w:t xml:space="preserve">Tap one annotation label</w:t>
+        <w:t xml:space="preserve">Verify labels for unselected peaks are hidden</w:t>
       </w:r>
     </w:p>
     <w:p>
@@ -6350,17 +6453,6 @@
         <w:numPr>
           <w:ilvl w:val="0"/>
           <w:numId w:val="1180"/>
-        </w:numPr>
-      </w:pPr>
-      <w:r>
-        <w:t xml:space="preserve">Verify only the tapped label is visible and all others are hidden</w:t>
-      </w:r>
-    </w:p>
-    <w:p>
-      <w:pPr>
-        <w:numPr>
-          <w:ilvl w:val="0"/>
-          <w:numId w:val="1181"/>
         </w:numPr>
       </w:pPr>
       <w:r>
@@ -6476,30 +6568,41 @@
       <w:pPr>
         <w:numPr>
           <w:ilvl w:val="0"/>
+          <w:numId w:val="1181"/>
+        </w:numPr>
+      </w:pPr>
+      <w:r>
+        <w:t xml:space="preserve">Tap</w:t>
+      </w:r>
+      <w:r>
+        <w:t xml:space="preserve"> </w:t>
+      </w:r>
+      <w:r>
+        <w:rPr>
+          <w:b/>
+          <w:bCs/>
+        </w:rPr>
+        <w:t xml:space="preserve">Save</w:t>
+      </w:r>
+      <w:r>
+        <w:t xml:space="preserve">; enter a name (e.g. </w:t>
+      </w:r>
+      <w:r>
+        <w:t xml:space="preserve">“Test spruce”</w:t>
+      </w:r>
+      <w:r>
+        <w:t xml:space="preserve">); confirm</w:t>
+      </w:r>
+    </w:p>
+    <w:p>
+      <w:pPr>
+        <w:numPr>
+          <w:ilvl w:val="0"/>
           <w:numId w:val="1182"/>
         </w:numPr>
       </w:pPr>
       <w:r>
-        <w:t xml:space="preserve">Tap</w:t>
-      </w:r>
-      <w:r>
-        <w:t xml:space="preserve"> </w:t>
-      </w:r>
-      <w:r>
-        <w:rPr>
-          <w:b/>
-          <w:bCs/>
-        </w:rPr>
-        <w:t xml:space="preserve">Save</w:t>
-      </w:r>
-      <w:r>
-        <w:t xml:space="preserve">; enter a name (e.g. </w:t>
-      </w:r>
-      <w:r>
-        <w:t xml:space="preserve">“Test spruce”</w:t>
-      </w:r>
-      <w:r>
-        <w:t xml:space="preserve">); confirm</w:t>
+        <w:t xml:space="preserve">Force-quit the app (swipe up from app switcher or Cmd+Q on macOS)</w:t>
       </w:r>
     </w:p>
     <w:p>
@@ -6510,7 +6613,7 @@
         </w:numPr>
       </w:pPr>
       <w:r>
-        <w:t xml:space="preserve">Force-quit the app (swipe up from app switcher or Cmd+Q on macOS)</w:t>
+        <w:t xml:space="preserve">Relaunch GuitarTap</w:t>
       </w:r>
     </w:p>
     <w:p>
@@ -6521,7 +6624,17 @@
         </w:numPr>
       </w:pPr>
       <w:r>
-        <w:t xml:space="preserve">Relaunch GuitarTap</w:t>
+        <w:t xml:space="preserve">Open</w:t>
+      </w:r>
+      <w:r>
+        <w:t xml:space="preserve"> </w:t>
+      </w:r>
+      <w:r>
+        <w:rPr>
+          <w:b/>
+          <w:bCs/>
+        </w:rPr>
+        <w:t xml:space="preserve">Measurements</w:t>
       </w:r>
     </w:p>
     <w:p>
@@ -6532,17 +6645,7 @@
         </w:numPr>
       </w:pPr>
       <w:r>
-        <w:t xml:space="preserve">Open</w:t>
-      </w:r>
-      <w:r>
-        <w:t xml:space="preserve"> </w:t>
-      </w:r>
-      <w:r>
-        <w:rPr>
-          <w:b/>
-          <w:bCs/>
-        </w:rPr>
-        <w:t xml:space="preserve">Measurements</w:t>
+        <w:t xml:space="preserve">Verify the saved measurement appears in the list with the correct name and date</w:t>
       </w:r>
     </w:p>
     <w:p>
@@ -6550,17 +6653,6 @@
         <w:numPr>
           <w:ilvl w:val="0"/>
           <w:numId w:val="1186"/>
-        </w:numPr>
-      </w:pPr>
-      <w:r>
-        <w:t xml:space="preserve">Verify the saved measurement appears in the list with the correct name and date</w:t>
-      </w:r>
-    </w:p>
-    <w:p>
-      <w:pPr>
-        <w:numPr>
-          <w:ilvl w:val="0"/>
-          <w:numId w:val="1187"/>
         </w:numPr>
       </w:pPr>
       <w:r>
@@ -6601,13 +6693,13 @@
       </w:r>
     </w:p>
     <w:bookmarkEnd w:id="51"/>
-    <w:bookmarkStart w:id="52" w:name="r8-export-json-is-valid"/>
+    <w:bookmarkStart w:id="52" w:name="X17249c8be2a1753da40d980becb5ef75de661c0"/>
     <w:p>
       <w:pPr>
         <w:pStyle w:val="Heading3"/>
       </w:pPr>
       <w:r>
-        <w:t xml:space="preserve">R8 — Export JSON is valid</w:t>
+        <w:t xml:space="preserve">R8 — Export Measurement round-trip — export and re-import matches original</w:t>
       </w:r>
     </w:p>
     <w:p>
@@ -6659,7 +6751,31 @@
         <w:t xml:space="preserve"> </w:t>
       </w:r>
       <w:r>
-        <w:t xml:space="preserve">A measurement is saved.</w:t>
+        <w:t xml:space="preserve">A measurement with peaks is saved.</w:t>
+      </w:r>
+    </w:p>
+    <w:p>
+      <w:pPr>
+        <w:numPr>
+          <w:ilvl w:val="0"/>
+          <w:numId w:val="1187"/>
+        </w:numPr>
+      </w:pPr>
+      <w:r>
+        <w:t xml:space="preserve">Open the Measurements list; right-click (macOS) or long-press (iOS/iPadOS) the row and choose</w:t>
+      </w:r>
+      <w:r>
+        <w:t xml:space="preserve"> </w:t>
+      </w:r>
+      <w:r>
+        <w:rPr>
+          <w:b/>
+          <w:bCs/>
+        </w:rPr>
+        <w:t xml:space="preserve">View Details</w:t>
+      </w:r>
+      <w:r>
+        <w:t xml:space="preserve">; note the name, date, location/notes, and all peaks in the Results panel</w:t>
       </w:r>
     </w:p>
     <w:p>
@@ -6670,7 +6786,54 @@
         </w:numPr>
       </w:pPr>
       <w:r>
-        <w:t xml:space="preserve">Open the measurement in the detail view</w:t>
+        <w:t xml:space="preserve">Right-click (macOS) or long-press (iOS/iPadOS) the same row and choose</w:t>
+      </w:r>
+      <w:r>
+        <w:t xml:space="preserve"> </w:t>
+      </w:r>
+      <w:r>
+        <w:rPr>
+          <w:b/>
+          <w:bCs/>
+        </w:rPr>
+        <w:t xml:space="preserve">Save Measurement to Disk…</w:t>
+      </w:r>
+      <w:r>
+        <w:t xml:space="preserve"> </w:t>
+      </w:r>
+      <w:r>
+        <w:t xml:space="preserve">(macOS) or</w:t>
+      </w:r>
+      <w:r>
+        <w:t xml:space="preserve"> </w:t>
+      </w:r>
+      <w:r>
+        <w:rPr>
+          <w:b/>
+          <w:bCs/>
+        </w:rPr>
+        <w:t xml:space="preserve">Export Measurement</w:t>
+      </w:r>
+      <w:r>
+        <w:t xml:space="preserve"> </w:t>
+      </w:r>
+      <w:r>
+        <w:t xml:space="preserve">(iOS/iPadOS); save the</w:t>
+      </w:r>
+      <w:r>
+        <w:t xml:space="preserve"> </w:t>
+      </w:r>
+      <w:r>
+        <w:rPr>
+          <w:rStyle w:val="VerbatimChar"/>
+        </w:rPr>
+        <w:t xml:space="preserve">.guitartap</w:t>
+      </w:r>
+      <w:r>
+        <w:t xml:space="preserve"> </w:t>
+      </w:r>
+      <w:r>
+        <w:t xml:space="preserve">file</w:t>
       </w:r>
     </w:p>
     <w:p>
@@ -6681,17 +6844,39 @@
         </w:numPr>
       </w:pPr>
       <w:r>
-        <w:t xml:space="preserve">Tap</w:t>
-      </w:r>
-      <w:r>
-        <w:t xml:space="preserve"> </w:t>
-      </w:r>
-      <w:r>
-        <w:rPr>
-          <w:b/>
-          <w:bCs/>
-        </w:rPr>
-        <w:t xml:space="preserve">Export → JSON</w:t>
+        <w:t xml:space="preserve">Import the file using the</w:t>
+      </w:r>
+      <w:r>
+        <w:t xml:space="preserve"> </w:t>
+      </w:r>
+      <w:r>
+        <w:rPr>
+          <w:b/>
+          <w:bCs/>
+        </w:rPr>
+        <w:t xml:space="preserve">Import</w:t>
+      </w:r>
+      <w:r>
+        <w:t xml:space="preserve"> </w:t>
+      </w:r>
+      <w:r>
+        <w:t xml:space="preserve">toolbar button (macOS) or ellipsis →</w:t>
+      </w:r>
+      <w:r>
+        <w:t xml:space="preserve"> </w:t>
+      </w:r>
+      <w:r>
+        <w:rPr>
+          <w:b/>
+          <w:bCs/>
+        </w:rPr>
+        <w:t xml:space="preserve">Import Measurement</w:t>
+      </w:r>
+      <w:r>
+        <w:t xml:space="preserve"> </w:t>
+      </w:r>
+      <w:r>
+        <w:t xml:space="preserve">(iOS/iPadOS)</w:t>
       </w:r>
     </w:p>
     <w:p>
@@ -6702,7 +6887,17 @@
         </w:numPr>
       </w:pPr>
       <w:r>
-        <w:t xml:space="preserve">Share or save the file to Files / Finder</w:t>
+        <w:t xml:space="preserve">Right-click (macOS) or long-press (iOS/iPadOS) the newly imported row and choose</w:t>
+      </w:r>
+      <w:r>
+        <w:t xml:space="preserve"> </w:t>
+      </w:r>
+      <w:r>
+        <w:rPr>
+          <w:b/>
+          <w:bCs/>
+        </w:rPr>
+        <w:t xml:space="preserve">View Details</w:t>
       </w:r>
     </w:p>
     <w:p>
@@ -6713,7 +6908,7 @@
         </w:numPr>
       </w:pPr>
       <w:r>
-        <w:t xml:space="preserve">Open the file in a JSON viewer or text editor</w:t>
+        <w:t xml:space="preserve">Verify the name, date, and location/notes match the original</w:t>
       </w:r>
     </w:p>
     <w:p>
@@ -6724,7 +6919,7 @@
         </w:numPr>
       </w:pPr>
       <w:r>
-        <w:t xml:space="preserve">Confirm the file opens without parse errors</w:t>
+        <w:t xml:space="preserve">Verify the Results panel shows the same peaks with the same frequencies, magnitudes, and mode assignments</w:t>
       </w:r>
     </w:p>
     <w:p>
@@ -6735,52 +6930,7 @@
         </w:numPr>
       </w:pPr>
       <w:r>
-        <w:t xml:space="preserve">Verify the file contains fields:</w:t>
-      </w:r>
-      <w:r>
-        <w:t xml:space="preserve"> </w:t>
-      </w:r>
-      <w:r>
-        <w:rPr>
-          <w:rStyle w:val="VerbatimChar"/>
-        </w:rPr>
-        <w:t xml:space="preserve">timestamp</w:t>
-      </w:r>
-      <w:r>
-        <w:t xml:space="preserve">,</w:t>
-      </w:r>
-      <w:r>
-        <w:t xml:space="preserve"> </w:t>
-      </w:r>
-      <w:r>
-        <w:rPr>
-          <w:rStyle w:val="VerbatimChar"/>
-        </w:rPr>
-        <w:t xml:space="preserve">peaks</w:t>
-      </w:r>
-      <w:r>
-        <w:t xml:space="preserve">,</w:t>
-      </w:r>
-      <w:r>
-        <w:t xml:space="preserve"> </w:t>
-      </w:r>
-      <w:r>
-        <w:rPr>
-          <w:rStyle w:val="VerbatimChar"/>
-        </w:rPr>
-        <w:t xml:space="preserve">annotationOffsets</w:t>
-      </w:r>
-      <w:r>
-        <w:t xml:space="preserve">,</w:t>
-      </w:r>
-      <w:r>
-        <w:t xml:space="preserve"> </w:t>
-      </w:r>
-      <w:r>
-        <w:rPr>
-          <w:rStyle w:val="VerbatimChar"/>
-        </w:rPr>
-        <w:t xml:space="preserve">guitarType</w:t>
+        <w:t xml:space="preserve">Verify the spectrum chart appearance matches the original</w:t>
       </w:r>
     </w:p>
     <w:p>
@@ -7021,13 +7171,13 @@
       </w:r>
     </w:p>
     <w:bookmarkEnd w:id="53"/>
-    <w:bookmarkStart w:id="54" w:name="r10-icloud-sync-between-two-devices"/>
+    <w:bookmarkStart w:id="54" w:name="X4f82ed0d592183f1ee98bf5cfc2ac1b54963a6f"/>
     <w:p>
       <w:pPr>
         <w:pStyle w:val="Heading3"/>
       </w:pPr>
       <w:r>
-        <w:t xml:space="preserve">R10 — iCloud sync between two devices</w:t>
+        <w:t xml:space="preserve">R10 — Cross-device transfer via export/import</w:t>
       </w:r>
     </w:p>
     <w:p>
@@ -7045,7 +7195,7 @@
         <w:t xml:space="preserve"> </w:t>
       </w:r>
       <w:r>
-        <w:t xml:space="preserve">iOS · iPadOS</w:t>
+        <w:t xml:space="preserve">iOS · iPadOS · macOS</w:t>
       </w:r>
       <w:r>
         <w:t xml:space="preserve"> </w:t>
@@ -7066,7 +7216,25 @@
     </w:p>
     <w:p>
       <w:pPr>
-        <w:pStyle w:val="BodyText"/>
+        <w:pStyle w:val="BlockText"/>
+      </w:pPr>
+      <w:r>
+        <w:rPr>
+          <w:b/>
+          <w:bCs/>
+        </w:rPr>
+        <w:t xml:space="preserve">Note:</w:t>
+      </w:r>
+      <w:r>
+        <w:t xml:space="preserve"> </w:t>
+      </w:r>
+      <w:r>
+        <w:t xml:space="preserve">No automatic iCloud sync — cross-device transfer requires manual export/import.</w:t>
+      </w:r>
+    </w:p>
+    <w:p>
+      <w:pPr>
+        <w:pStyle w:val="FirstParagraph"/>
       </w:pPr>
       <w:r>
         <w:rPr>
@@ -7079,7 +7247,7 @@
         <w:t xml:space="preserve"> </w:t>
       </w:r>
       <w:r>
-        <w:t xml:space="preserve">iPhone and iPad signed into the same iCloud account. iCloud Drive enabled.</w:t>
+        <w:t xml:space="preserve">Two devices with GuitarTap installed. A measurement is saved on device A.</w:t>
       </w:r>
     </w:p>
     <w:p>
@@ -7090,7 +7258,54 @@
         </w:numPr>
       </w:pPr>
       <w:r>
-        <w:t xml:space="preserve">Save a measurement on the iPhone</w:t>
+        <w:t xml:space="preserve">On device A: choose</w:t>
+      </w:r>
+      <w:r>
+        <w:t xml:space="preserve"> </w:t>
+      </w:r>
+      <w:r>
+        <w:rPr>
+          <w:b/>
+          <w:bCs/>
+        </w:rPr>
+        <w:t xml:space="preserve">Export Measurement</w:t>
+      </w:r>
+      <w:r>
+        <w:t xml:space="preserve"> </w:t>
+      </w:r>
+      <w:r>
+        <w:t xml:space="preserve">(iOS/iPadOS, or macOS for share sheet) or</w:t>
+      </w:r>
+      <w:r>
+        <w:t xml:space="preserve"> </w:t>
+      </w:r>
+      <w:r>
+        <w:rPr>
+          <w:b/>
+          <w:bCs/>
+        </w:rPr>
+        <w:t xml:space="preserve">Save Measurement to Disk…</w:t>
+      </w:r>
+      <w:r>
+        <w:t xml:space="preserve"> </w:t>
+      </w:r>
+      <w:r>
+        <w:t xml:space="preserve">(macOS for save to disk); send the</w:t>
+      </w:r>
+      <w:r>
+        <w:t xml:space="preserve"> </w:t>
+      </w:r>
+      <w:r>
+        <w:rPr>
+          <w:rStyle w:val="VerbatimChar"/>
+        </w:rPr>
+        <w:t xml:space="preserve">.guitartap</w:t>
+      </w:r>
+      <w:r>
+        <w:t xml:space="preserve"> </w:t>
+      </w:r>
+      <w:r>
+        <w:t xml:space="preserve">file to device B via AirDrop, Files/iCloud Drive, or email; AirDrop will route the file directly to GuitarTap on the receiving device</w:t>
       </w:r>
     </w:p>
     <w:p>
@@ -7101,7 +7316,54 @@
         </w:numPr>
       </w:pPr>
       <w:r>
-        <w:t xml:space="preserve">Wait up to 30 s</w:t>
+        <w:t xml:space="preserve">On device B: import the file using</w:t>
+      </w:r>
+      <w:r>
+        <w:t xml:space="preserve"> </w:t>
+      </w:r>
+      <w:r>
+        <w:rPr>
+          <w:b/>
+          <w:bCs/>
+        </w:rPr>
+        <w:t xml:space="preserve">Import</w:t>
+      </w:r>
+      <w:r>
+        <w:t xml:space="preserve"> </w:t>
+      </w:r>
+      <w:r>
+        <w:t xml:space="preserve">toolbar button (macOS) or ellipsis →</w:t>
+      </w:r>
+      <w:r>
+        <w:t xml:space="preserve"> </w:t>
+      </w:r>
+      <w:r>
+        <w:rPr>
+          <w:b/>
+          <w:bCs/>
+        </w:rPr>
+        <w:t xml:space="preserve">Import Measurement</w:t>
+      </w:r>
+      <w:r>
+        <w:t xml:space="preserve"> </w:t>
+      </w:r>
+      <w:r>
+        <w:t xml:space="preserve">(iOS/iPadOS); legacy</w:t>
+      </w:r>
+      <w:r>
+        <w:t xml:space="preserve"> </w:t>
+      </w:r>
+      <w:r>
+        <w:rPr>
+          <w:rStyle w:val="VerbatimChar"/>
+        </w:rPr>
+        <w:t xml:space="preserve">.json</w:t>
+      </w:r>
+      <w:r>
+        <w:t xml:space="preserve"> </w:t>
+      </w:r>
+      <w:r>
+        <w:t xml:space="preserve">files are also accepted</w:t>
       </w:r>
     </w:p>
     <w:p>
@@ -7112,7 +7374,7 @@
         </w:numPr>
       </w:pPr>
       <w:r>
-        <w:t xml:space="preserve">Open Measurements on the iPad</w:t>
+        <w:t xml:space="preserve">Verify the measurement appears in the list on device B</w:t>
       </w:r>
     </w:p>
     <w:p>
@@ -7120,17 +7382,6 @@
         <w:numPr>
           <w:ilvl w:val="0"/>
           <w:numId w:val="1206"/>
-        </w:numPr>
-      </w:pPr>
-      <w:r>
-        <w:t xml:space="preserve">Verify the measurement saved on the iPhone appears in the list on the iPad</w:t>
-      </w:r>
-    </w:p>
-    <w:p>
-      <w:pPr>
-        <w:numPr>
-          <w:ilvl w:val="0"/>
-          <w:numId w:val="1207"/>
         </w:numPr>
       </w:pPr>
       <w:r>
@@ -7246,11 +7497,22 @@
       <w:pPr>
         <w:numPr>
           <w:ilvl w:val="0"/>
+          <w:numId w:val="1207"/>
+        </w:numPr>
+      </w:pPr>
+      <w:r>
+        <w:t xml:space="preserve">Launch GuitarTap on iPhone in portrait</w:t>
+      </w:r>
+    </w:p>
+    <w:p>
+      <w:pPr>
+        <w:numPr>
+          <w:ilvl w:val="0"/>
           <w:numId w:val="1208"/>
         </w:numPr>
       </w:pPr>
       <w:r>
-        <w:t xml:space="preserve">Launch GuitarTap on iPhone</w:t>
+        <w:t xml:space="preserve">Verify nav bar left: Start/Stop, Results</w:t>
       </w:r>
     </w:p>
     <w:p>
@@ -7261,7 +7523,7 @@
         </w:numPr>
       </w:pPr>
       <w:r>
-        <w:t xml:space="preserve">Verify these controls are visible or accessible via toolbar: Start/Stop, Results, Save, Settings, Measurements</w:t>
+        <w:t xml:space="preserve">Verify nav bar right: Metrics, Settings</w:t>
       </w:r>
     </w:p>
     <w:p>
@@ -7272,7 +7534,7 @@
         </w:numPr>
       </w:pPr>
       <w:r>
-        <w:t xml:space="preserve">Verify secondary controls are accessible: Export Spectrum, Auto dB, Crosshair, Annotations</w:t>
+        <w:t xml:space="preserve">Verify header button bar: Auto dB, Crosshair, Annotations, Save, Measurements (icon-only bordered buttons)</w:t>
       </w:r>
     </w:p>
     <w:p>
@@ -7283,7 +7545,7 @@
         </w:numPr>
       </w:pPr>
       <w:r>
-        <w:t xml:space="preserve">Confirm no required button is clipped, hidden under another element, or missing</w:t>
+        <w:t xml:space="preserve">Rotate to landscape</w:t>
       </w:r>
     </w:p>
     <w:p>
@@ -7291,6 +7553,39 @@
         <w:numPr>
           <w:ilvl w:val="0"/>
           <w:numId w:val="1212"/>
+        </w:numPr>
+      </w:pPr>
+      <w:r>
+        <w:t xml:space="preserve">Verify nav bar left: Start/Stop, Results, Auto dB, Crosshair</w:t>
+      </w:r>
+    </w:p>
+    <w:p>
+      <w:pPr>
+        <w:numPr>
+          <w:ilvl w:val="0"/>
+          <w:numId w:val="1213"/>
+        </w:numPr>
+      </w:pPr>
+      <w:r>
+        <w:t xml:space="preserve">Verify nav bar right: Annotations, Save, Measurements, Metrics, Settings</w:t>
+      </w:r>
+    </w:p>
+    <w:p>
+      <w:pPr>
+        <w:numPr>
+          <w:ilvl w:val="0"/>
+          <w:numId w:val="1214"/>
+        </w:numPr>
+      </w:pPr>
+      <w:r>
+        <w:t xml:space="preserve">Confirm no button is clipped, hidden, or missing in either orientation</w:t>
+      </w:r>
+    </w:p>
+    <w:p>
+      <w:pPr>
+        <w:numPr>
+          <w:ilvl w:val="0"/>
+          <w:numId w:val="1215"/>
         </w:numPr>
       </w:pPr>
       <w:r>
@@ -7396,7 +7691,7 @@
       <w:pPr>
         <w:numPr>
           <w:ilvl w:val="0"/>
-          <w:numId w:val="1213"/>
+          <w:numId w:val="1216"/>
         </w:numPr>
       </w:pPr>
       <w:r>
@@ -7407,7 +7702,7 @@
       <w:pPr>
         <w:numPr>
           <w:ilvl w:val="0"/>
-          <w:numId w:val="1214"/>
+          <w:numId w:val="1217"/>
         </w:numPr>
       </w:pPr>
       <w:r>
@@ -7418,7 +7713,7 @@
       <w:pPr>
         <w:numPr>
           <w:ilvl w:val="0"/>
-          <w:numId w:val="1215"/>
+          <w:numId w:val="1218"/>
         </w:numPr>
       </w:pPr>
       <w:r>
@@ -7429,7 +7724,7 @@
       <w:pPr>
         <w:numPr>
           <w:ilvl w:val="0"/>
-          <w:numId w:val="1216"/>
+          <w:numId w:val="1219"/>
         </w:numPr>
       </w:pPr>
       <w:r>
@@ -7440,7 +7735,7 @@
       <w:pPr>
         <w:numPr>
           <w:ilvl w:val="0"/>
-          <w:numId w:val="1217"/>
+          <w:numId w:val="1220"/>
         </w:numPr>
       </w:pPr>
       <w:r>
@@ -7546,7 +7841,7 @@
       <w:pPr>
         <w:numPr>
           <w:ilvl w:val="0"/>
-          <w:numId w:val="1218"/>
+          <w:numId w:val="1221"/>
         </w:numPr>
       </w:pPr>
       <w:r>
@@ -7557,18 +7852,18 @@
       <w:pPr>
         <w:numPr>
           <w:ilvl w:val="0"/>
-          <w:numId w:val="1219"/>
-        </w:numPr>
-      </w:pPr>
-      <w:r>
-        <w:t xml:space="preserve">Verify the single-row button layout shows: Start, Results, Metrics, Save, Export Spectrum, Auto dB, Annotations, Measurements, Settings</w:t>
-      </w:r>
-    </w:p>
-    <w:p>
-      <w:pPr>
-        <w:numPr>
-          <w:ilvl w:val="0"/>
-          <w:numId w:val="1220"/>
+          <w:numId w:val="1222"/>
+        </w:numPr>
+      </w:pPr>
+      <w:r>
+        <w:t xml:space="preserve">Verify the single-row button layout shows: Start, Results, Auto dB, Annotations, Save, Measurements, Metrics, Settings</w:t>
+      </w:r>
+    </w:p>
+    <w:p>
+      <w:pPr>
+        <w:numPr>
+          <w:ilvl w:val="0"/>
+          <w:numId w:val="1223"/>
         </w:numPr>
       </w:pPr>
       <w:r>
@@ -7579,7 +7874,7 @@
       <w:pPr>
         <w:numPr>
           <w:ilvl w:val="0"/>
-          <w:numId w:val="1221"/>
+          <w:numId w:val="1224"/>
         </w:numPr>
       </w:pPr>
       <w:r>
@@ -7685,7 +7980,7 @@
       <w:pPr>
         <w:numPr>
           <w:ilvl w:val="0"/>
-          <w:numId w:val="1222"/>
+          <w:numId w:val="1225"/>
         </w:numPr>
       </w:pPr>
       <w:r>
@@ -7696,7 +7991,7 @@
       <w:pPr>
         <w:numPr>
           <w:ilvl w:val="0"/>
-          <w:numId w:val="1223"/>
+          <w:numId w:val="1226"/>
         </w:numPr>
       </w:pPr>
       <w:r>
@@ -7722,7 +8017,7 @@
       <w:pPr>
         <w:numPr>
           <w:ilvl w:val="0"/>
-          <w:numId w:val="1224"/>
+          <w:numId w:val="1227"/>
         </w:numPr>
       </w:pPr>
       <w:r>
@@ -7733,7 +8028,7 @@
       <w:pPr>
         <w:numPr>
           <w:ilvl w:val="0"/>
-          <w:numId w:val="1225"/>
+          <w:numId w:val="1228"/>
         </w:numPr>
       </w:pPr>
       <w:r>
@@ -7744,7 +8039,7 @@
       <w:pPr>
         <w:numPr>
           <w:ilvl w:val="0"/>
-          <w:numId w:val="1226"/>
+          <w:numId w:val="1229"/>
         </w:numPr>
       </w:pPr>
       <w:r>
@@ -7850,7 +8145,7 @@
       <w:pPr>
         <w:numPr>
           <w:ilvl w:val="0"/>
-          <w:numId w:val="1227"/>
+          <w:numId w:val="1230"/>
         </w:numPr>
       </w:pPr>
       <w:r>
@@ -7861,7 +8156,7 @@
       <w:pPr>
         <w:numPr>
           <w:ilvl w:val="0"/>
-          <w:numId w:val="1228"/>
+          <w:numId w:val="1231"/>
         </w:numPr>
       </w:pPr>
       <w:r>
@@ -7872,7 +8167,7 @@
       <w:pPr>
         <w:numPr>
           <w:ilvl w:val="0"/>
-          <w:numId w:val="1229"/>
+          <w:numId w:val="1232"/>
         </w:numPr>
       </w:pPr>
       <w:r>
@@ -7883,7 +8178,7 @@
       <w:pPr>
         <w:numPr>
           <w:ilvl w:val="0"/>
-          <w:numId w:val="1230"/>
+          <w:numId w:val="1233"/>
         </w:numPr>
       </w:pPr>
       <w:r>
@@ -7894,7 +8189,7 @@
       <w:pPr>
         <w:numPr>
           <w:ilvl w:val="0"/>
-          <w:numId w:val="1231"/>
+          <w:numId w:val="1234"/>
         </w:numPr>
       </w:pPr>
       <w:r>
@@ -8000,7 +8295,7 @@
       <w:pPr>
         <w:numPr>
           <w:ilvl w:val="0"/>
-          <w:numId w:val="1232"/>
+          <w:numId w:val="1235"/>
         </w:numPr>
       </w:pPr>
       <w:r>
@@ -8011,7 +8306,7 @@
       <w:pPr>
         <w:numPr>
           <w:ilvl w:val="0"/>
-          <w:numId w:val="1233"/>
+          <w:numId w:val="1236"/>
         </w:numPr>
       </w:pPr>
       <w:r>
@@ -8022,7 +8317,7 @@
       <w:pPr>
         <w:numPr>
           <w:ilvl w:val="0"/>
-          <w:numId w:val="1234"/>
+          <w:numId w:val="1237"/>
         </w:numPr>
       </w:pPr>
       <w:r>
@@ -8045,7 +8340,7 @@
       <w:pPr>
         <w:numPr>
           <w:ilvl w:val="0"/>
-          <w:numId w:val="1235"/>
+          <w:numId w:val="1238"/>
         </w:numPr>
       </w:pPr>
       <w:r>
@@ -8056,7 +8351,7 @@
       <w:pPr>
         <w:numPr>
           <w:ilvl w:val="0"/>
-          <w:numId w:val="1236"/>
+          <w:numId w:val="1239"/>
         </w:numPr>
       </w:pPr>
       <w:r>
@@ -8067,7 +8362,7 @@
       <w:pPr>
         <w:numPr>
           <w:ilvl w:val="0"/>
-          <w:numId w:val="1237"/>
+          <w:numId w:val="1240"/>
         </w:numPr>
       </w:pPr>
       <w:r>
@@ -8173,7 +8468,7 @@
       <w:pPr>
         <w:numPr>
           <w:ilvl w:val="0"/>
-          <w:numId w:val="1238"/>
+          <w:numId w:val="1241"/>
         </w:numPr>
       </w:pPr>
       <w:r>
@@ -8194,7 +8489,7 @@
       <w:pPr>
         <w:numPr>
           <w:ilvl w:val="0"/>
-          <w:numId w:val="1239"/>
+          <w:numId w:val="1242"/>
         </w:numPr>
       </w:pPr>
       <w:r>
@@ -8205,7 +8500,7 @@
       <w:pPr>
         <w:numPr>
           <w:ilvl w:val="0"/>
-          <w:numId w:val="1240"/>
+          <w:numId w:val="1243"/>
         </w:numPr>
       </w:pPr>
       <w:r>
@@ -8216,7 +8511,7 @@
       <w:pPr>
         <w:numPr>
           <w:ilvl w:val="0"/>
-          <w:numId w:val="1241"/>
+          <w:numId w:val="1244"/>
         </w:numPr>
       </w:pPr>
       <w:r>
@@ -8237,7 +8532,7 @@
       <w:pPr>
         <w:numPr>
           <w:ilvl w:val="0"/>
-          <w:numId w:val="1242"/>
+          <w:numId w:val="1245"/>
         </w:numPr>
       </w:pPr>
       <w:r>
@@ -8248,7 +8543,7 @@
       <w:pPr>
         <w:numPr>
           <w:ilvl w:val="0"/>
-          <w:numId w:val="1243"/>
+          <w:numId w:val="1246"/>
         </w:numPr>
       </w:pPr>
       <w:r>
@@ -8354,7 +8649,7 @@
       <w:pPr>
         <w:numPr>
           <w:ilvl w:val="0"/>
-          <w:numId w:val="1244"/>
+          <w:numId w:val="1247"/>
         </w:numPr>
       </w:pPr>
       <w:r>
@@ -8375,7 +8670,7 @@
       <w:pPr>
         <w:numPr>
           <w:ilvl w:val="0"/>
-          <w:numId w:val="1245"/>
+          <w:numId w:val="1248"/>
         </w:numPr>
       </w:pPr>
       <w:r>
@@ -8386,7 +8681,7 @@
       <w:pPr>
         <w:numPr>
           <w:ilvl w:val="0"/>
-          <w:numId w:val="1246"/>
+          <w:numId w:val="1249"/>
         </w:numPr>
       </w:pPr>
       <w:r>
@@ -8397,7 +8692,7 @@
       <w:pPr>
         <w:numPr>
           <w:ilvl w:val="0"/>
-          <w:numId w:val="1247"/>
+          <w:numId w:val="1250"/>
         </w:numPr>
       </w:pPr>
       <w:r>
@@ -8408,7 +8703,7 @@
       <w:pPr>
         <w:numPr>
           <w:ilvl w:val="0"/>
-          <w:numId w:val="1248"/>
+          <w:numId w:val="1251"/>
         </w:numPr>
       </w:pPr>
       <w:r>
@@ -8514,7 +8809,7 @@
       <w:pPr>
         <w:numPr>
           <w:ilvl w:val="0"/>
-          <w:numId w:val="1249"/>
+          <w:numId w:val="1252"/>
         </w:numPr>
       </w:pPr>
       <w:r>
@@ -8535,7 +8830,7 @@
       <w:pPr>
         <w:numPr>
           <w:ilvl w:val="0"/>
-          <w:numId w:val="1250"/>
+          <w:numId w:val="1253"/>
         </w:numPr>
       </w:pPr>
       <w:r>
@@ -8546,7 +8841,7 @@
       <w:pPr>
         <w:numPr>
           <w:ilvl w:val="0"/>
-          <w:numId w:val="1251"/>
+          <w:numId w:val="1254"/>
         </w:numPr>
       </w:pPr>
       <w:r>
@@ -8557,7 +8852,7 @@
       <w:pPr>
         <w:numPr>
           <w:ilvl w:val="0"/>
-          <w:numId w:val="1252"/>
+          <w:numId w:val="1255"/>
         </w:numPr>
       </w:pPr>
       <w:r>
@@ -8578,7 +8873,7 @@
       <w:pPr>
         <w:numPr>
           <w:ilvl w:val="0"/>
-          <w:numId w:val="1253"/>
+          <w:numId w:val="1256"/>
         </w:numPr>
       </w:pPr>
       <w:r>
@@ -8589,7 +8884,7 @@
       <w:pPr>
         <w:numPr>
           <w:ilvl w:val="0"/>
-          <w:numId w:val="1254"/>
+          <w:numId w:val="1257"/>
         </w:numPr>
       </w:pPr>
       <w:r>
@@ -8695,7 +8990,7 @@
       <w:pPr>
         <w:numPr>
           <w:ilvl w:val="0"/>
-          <w:numId w:val="1255"/>
+          <w:numId w:val="1258"/>
         </w:numPr>
       </w:pPr>
       <w:r>
@@ -8716,7 +9011,7 @@
       <w:pPr>
         <w:numPr>
           <w:ilvl w:val="0"/>
-          <w:numId w:val="1256"/>
+          <w:numId w:val="1259"/>
         </w:numPr>
       </w:pPr>
       <w:r>
@@ -8727,7 +9022,7 @@
       <w:pPr>
         <w:numPr>
           <w:ilvl w:val="0"/>
-          <w:numId w:val="1257"/>
+          <w:numId w:val="1260"/>
         </w:numPr>
       </w:pPr>
       <w:r>
@@ -8833,7 +9128,7 @@
       <w:pPr>
         <w:numPr>
           <w:ilvl w:val="0"/>
-          <w:numId w:val="1258"/>
+          <w:numId w:val="1261"/>
         </w:numPr>
       </w:pPr>
       <w:r>
@@ -8844,7 +9139,7 @@
       <w:pPr>
         <w:numPr>
           <w:ilvl w:val="0"/>
-          <w:numId w:val="1259"/>
+          <w:numId w:val="1262"/>
         </w:numPr>
       </w:pPr>
       <w:r>
@@ -8855,7 +9150,7 @@
       <w:pPr>
         <w:numPr>
           <w:ilvl w:val="0"/>
-          <w:numId w:val="1260"/>
+          <w:numId w:val="1263"/>
         </w:numPr>
       </w:pPr>
       <w:r>
@@ -8866,7 +9161,7 @@
       <w:pPr>
         <w:numPr>
           <w:ilvl w:val="0"/>
-          <w:numId w:val="1261"/>
+          <w:numId w:val="1264"/>
         </w:numPr>
       </w:pPr>
       <w:r>
@@ -8877,7 +9172,7 @@
       <w:pPr>
         <w:numPr>
           <w:ilvl w:val="0"/>
-          <w:numId w:val="1262"/>
+          <w:numId w:val="1265"/>
         </w:numPr>
       </w:pPr>
       <w:r>
@@ -8888,7 +9183,7 @@
       <w:pPr>
         <w:numPr>
           <w:ilvl w:val="0"/>
-          <w:numId w:val="1263"/>
+          <w:numId w:val="1266"/>
         </w:numPr>
       </w:pPr>
       <w:r>
@@ -8899,7 +9194,7 @@
       <w:pPr>
         <w:numPr>
           <w:ilvl w:val="0"/>
-          <w:numId w:val="1264"/>
+          <w:numId w:val="1267"/>
         </w:numPr>
       </w:pPr>
       <w:r>
@@ -8910,7 +9205,7 @@
       <w:pPr>
         <w:numPr>
           <w:ilvl w:val="0"/>
-          <w:numId w:val="1265"/>
+          <w:numId w:val="1268"/>
         </w:numPr>
       </w:pPr>
       <w:r>
@@ -9032,7 +9327,7 @@
       <w:pPr>
         <w:numPr>
           <w:ilvl w:val="0"/>
-          <w:numId w:val="1266"/>
+          <w:numId w:val="1269"/>
         </w:numPr>
       </w:pPr>
       <w:r>
@@ -9043,7 +9338,7 @@
       <w:pPr>
         <w:numPr>
           <w:ilvl w:val="0"/>
-          <w:numId w:val="1267"/>
+          <w:numId w:val="1270"/>
         </w:numPr>
       </w:pPr>
       <w:r>
@@ -9054,7 +9349,7 @@
       <w:pPr>
         <w:numPr>
           <w:ilvl w:val="0"/>
-          <w:numId w:val="1268"/>
+          <w:numId w:val="1271"/>
         </w:numPr>
       </w:pPr>
       <w:r>
@@ -9081,7 +9376,7 @@
       <w:pPr>
         <w:numPr>
           <w:ilvl w:val="0"/>
-          <w:numId w:val="1269"/>
+          <w:numId w:val="1272"/>
         </w:numPr>
       </w:pPr>
       <w:r>
@@ -9108,7 +9403,7 @@
       <w:pPr>
         <w:numPr>
           <w:ilvl w:val="0"/>
-          <w:numId w:val="1270"/>
+          <w:numId w:val="1273"/>
         </w:numPr>
       </w:pPr>
       <w:r>
@@ -9119,7 +9414,7 @@
       <w:pPr>
         <w:numPr>
           <w:ilvl w:val="0"/>
-          <w:numId w:val="1271"/>
+          <w:numId w:val="1274"/>
         </w:numPr>
       </w:pPr>
       <w:r>
@@ -9130,7 +9425,7 @@
       <w:pPr>
         <w:numPr>
           <w:ilvl w:val="0"/>
-          <w:numId w:val="1272"/>
+          <w:numId w:val="1275"/>
         </w:numPr>
       </w:pPr>
       <w:r>
@@ -9246,7 +9541,7 @@
       <w:pPr>
         <w:numPr>
           <w:ilvl w:val="0"/>
-          <w:numId w:val="1273"/>
+          <w:numId w:val="1276"/>
         </w:numPr>
       </w:pPr>
       <w:r>
@@ -9257,7 +9552,7 @@
       <w:pPr>
         <w:numPr>
           <w:ilvl w:val="0"/>
-          <w:numId w:val="1274"/>
+          <w:numId w:val="1277"/>
         </w:numPr>
       </w:pPr>
       <w:r>
@@ -9268,7 +9563,7 @@
       <w:pPr>
         <w:numPr>
           <w:ilvl w:val="0"/>
-          <w:numId w:val="1275"/>
+          <w:numId w:val="1278"/>
         </w:numPr>
       </w:pPr>
       <w:r>
@@ -9279,7 +9574,7 @@
       <w:pPr>
         <w:numPr>
           <w:ilvl w:val="0"/>
-          <w:numId w:val="1276"/>
+          <w:numId w:val="1279"/>
         </w:numPr>
       </w:pPr>
       <w:r>
@@ -9302,7 +9597,7 @@
       <w:pPr>
         <w:numPr>
           <w:ilvl w:val="0"/>
-          <w:numId w:val="1277"/>
+          <w:numId w:val="1280"/>
         </w:numPr>
       </w:pPr>
       <w:r>
@@ -9401,7 +9696,34 @@
         <w:t xml:space="preserve"> </w:t>
       </w:r>
       <w:r>
-        <w:t xml:space="preserve">The</w:t>
+        <w:t xml:space="preserve">At least one measurement has been saved using the</w:t>
+      </w:r>
+      <w:r>
+        <w:t xml:space="preserve"> </w:t>
+      </w:r>
+      <w:r>
+        <w:rPr>
+          <w:b/>
+          <w:bCs/>
+        </w:rPr>
+        <w:t xml:space="preserve">Save</w:t>
+      </w:r>
+      <w:r>
+        <w:t xml:space="preserve"> </w:t>
+      </w:r>
+      <w:r>
+        <w:t xml:space="preserve">button during a previous tap tone session (see R8).</w:t>
+      </w:r>
+    </w:p>
+    <w:p>
+      <w:pPr>
+        <w:numPr>
+          <w:ilvl w:val="0"/>
+          <w:numId w:val="1281"/>
+        </w:numPr>
+      </w:pPr>
+      <w:r>
+        <w:t xml:space="preserve">Export the saved measurement to a</w:t>
       </w:r>
       <w:r>
         <w:t xml:space="preserve"> </w:t>
@@ -9410,58 +9732,95 @@
         <w:rPr>
           <w:rStyle w:val="VerbatimChar"/>
         </w:rPr>
-        <w:t xml:space="preserve">chris-1771351833.json</w:t>
-      </w:r>
-      <w:r>
-        <w:t xml:space="preserve"> </w:t>
-      </w:r>
-      <w:r>
-        <w:t xml:space="preserve">fixture file is available (included in the repo at</w:t>
-      </w:r>
-      <w:r>
-        <w:t xml:space="preserve"> </w:t>
-      </w:r>
-      <w:r>
-        <w:rPr>
-          <w:rStyle w:val="VerbatimChar"/>
-        </w:rPr>
-        <w:t xml:space="preserve">GuitarTapTests/</w:t>
-      </w:r>
-      <w:r>
-        <w:t xml:space="preserve">).</w:t>
-      </w:r>
-    </w:p>
-    <w:p>
-      <w:pPr>
-        <w:numPr>
-          <w:ilvl w:val="0"/>
-          <w:numId w:val="1278"/>
-        </w:numPr>
-      </w:pPr>
-      <w:r>
-        <w:t xml:space="preserve">Use Files (iOS) or Finder (macOS) to import</w:t>
-      </w:r>
-      <w:r>
-        <w:t xml:space="preserve"> </w:t>
-      </w:r>
-      <w:r>
-        <w:rPr>
-          <w:rStyle w:val="VerbatimChar"/>
-        </w:rPr>
-        <w:t xml:space="preserve">chris-1771351833.json</w:t>
-      </w:r>
-      <w:r>
-        <w:t xml:space="preserve"> </w:t>
-      </w:r>
-      <w:r>
-        <w:t xml:space="preserve">into GuitarTap</w:t>
-      </w:r>
-    </w:p>
-    <w:p>
-      <w:pPr>
-        <w:numPr>
-          <w:ilvl w:val="0"/>
-          <w:numId w:val="1279"/>
+        <w:t xml:space="preserve">.guitartap</w:t>
+      </w:r>
+      <w:r>
+        <w:t xml:space="preserve"> </w:t>
+      </w:r>
+      <w:r>
+        <w:t xml:space="preserve">file using</w:t>
+      </w:r>
+      <w:r>
+        <w:t xml:space="preserve"> </w:t>
+      </w:r>
+      <w:r>
+        <w:rPr>
+          <w:b/>
+          <w:bCs/>
+        </w:rPr>
+        <w:t xml:space="preserve">Export Measurement</w:t>
+      </w:r>
+      <w:r>
+        <w:t xml:space="preserve"> </w:t>
+      </w:r>
+      <w:r>
+        <w:t xml:space="preserve">(iOS/iPadOS share sheet) or</w:t>
+      </w:r>
+      <w:r>
+        <w:t xml:space="preserve"> </w:t>
+      </w:r>
+      <w:r>
+        <w:rPr>
+          <w:b/>
+          <w:bCs/>
+        </w:rPr>
+        <w:t xml:space="preserve">Save Measurement to Disk…</w:t>
+      </w:r>
+      <w:r>
+        <w:t xml:space="preserve"> </w:t>
+      </w:r>
+      <w:r>
+        <w:t xml:space="preserve">(macOS)</w:t>
+      </w:r>
+    </w:p>
+    <w:p>
+      <w:pPr>
+        <w:numPr>
+          <w:ilvl w:val="0"/>
+          <w:numId w:val="1282"/>
+        </w:numPr>
+      </w:pPr>
+      <w:r>
+        <w:t xml:space="preserve">Re-import it using</w:t>
+      </w:r>
+      <w:r>
+        <w:t xml:space="preserve"> </w:t>
+      </w:r>
+      <w:r>
+        <w:rPr>
+          <w:b/>
+          <w:bCs/>
+        </w:rPr>
+        <w:t xml:space="preserve">Import Measurement</w:t>
+      </w:r>
+      <w:r>
+        <w:t xml:space="preserve"> </w:t>
+      </w:r>
+      <w:r>
+        <w:t xml:space="preserve">(iOS/iPadOS) or the</w:t>
+      </w:r>
+      <w:r>
+        <w:t xml:space="preserve"> </w:t>
+      </w:r>
+      <w:r>
+        <w:rPr>
+          <w:b/>
+          <w:bCs/>
+        </w:rPr>
+        <w:t xml:space="preserve">Import</w:t>
+      </w:r>
+      <w:r>
+        <w:t xml:space="preserve"> </w:t>
+      </w:r>
+      <w:r>
+        <w:t xml:space="preserve">toolbar button (macOS)</w:t>
+      </w:r>
+    </w:p>
+    <w:p>
+      <w:pPr>
+        <w:numPr>
+          <w:ilvl w:val="0"/>
+          <w:numId w:val="1283"/>
         </w:numPr>
       </w:pPr>
       <w:r>
@@ -9472,7 +9831,7 @@
       <w:pPr>
         <w:numPr>
           <w:ilvl w:val="0"/>
-          <w:numId w:val="1280"/>
+          <w:numId w:val="1284"/>
         </w:numPr>
       </w:pPr>
       <w:r>
@@ -9483,7 +9842,7 @@
       <w:pPr>
         <w:numPr>
           <w:ilvl w:val="0"/>
-          <w:numId w:val="1281"/>
+          <w:numId w:val="1285"/>
         </w:numPr>
       </w:pPr>
       <w:r>
@@ -9494,7 +9853,7 @@
       <w:pPr>
         <w:numPr>
           <w:ilvl w:val="0"/>
-          <w:numId w:val="1282"/>
+          <w:numId w:val="1286"/>
         </w:numPr>
       </w:pPr>
       <w:r>
@@ -9600,7 +9959,7 @@
       <w:pPr>
         <w:numPr>
           <w:ilvl w:val="0"/>
-          <w:numId w:val="1283"/>
+          <w:numId w:val="1287"/>
         </w:numPr>
       </w:pPr>
       <w:r>
@@ -9621,7 +9980,7 @@
       <w:pPr>
         <w:numPr>
           <w:ilvl w:val="0"/>
-          <w:numId w:val="1284"/>
+          <w:numId w:val="1288"/>
         </w:numPr>
       </w:pPr>
       <w:r>
@@ -9632,7 +9991,7 @@
       <w:pPr>
         <w:numPr>
           <w:ilvl w:val="0"/>
-          <w:numId w:val="1285"/>
+          <w:numId w:val="1289"/>
         </w:numPr>
       </w:pPr>
       <w:r>
@@ -9653,7 +10012,7 @@
       <w:pPr>
         <w:numPr>
           <w:ilvl w:val="0"/>
-          <w:numId w:val="1286"/>
+          <w:numId w:val="1290"/>
         </w:numPr>
       </w:pPr>
       <w:r>
@@ -9664,7 +10023,7 @@
       <w:pPr>
         <w:numPr>
           <w:ilvl w:val="0"/>
-          <w:numId w:val="1287"/>
+          <w:numId w:val="1291"/>
         </w:numPr>
       </w:pPr>
       <w:r>
@@ -9675,7 +10034,7 @@
       <w:pPr>
         <w:numPr>
           <w:ilvl w:val="0"/>
-          <w:numId w:val="1288"/>
+          <w:numId w:val="1292"/>
         </w:numPr>
       </w:pPr>
       <w:r>
@@ -9781,7 +10140,7 @@
       <w:pPr>
         <w:numPr>
           <w:ilvl w:val="0"/>
-          <w:numId w:val="1289"/>
+          <w:numId w:val="1293"/>
         </w:numPr>
       </w:pPr>
       <w:r>
@@ -9792,7 +10151,7 @@
       <w:pPr>
         <w:numPr>
           <w:ilvl w:val="0"/>
-          <w:numId w:val="1290"/>
+          <w:numId w:val="1294"/>
         </w:numPr>
       </w:pPr>
       <w:r>
@@ -9813,7 +10172,7 @@
       <w:pPr>
         <w:numPr>
           <w:ilvl w:val="0"/>
-          <w:numId w:val="1291"/>
+          <w:numId w:val="1295"/>
         </w:numPr>
       </w:pPr>
       <w:r>
@@ -9824,7 +10183,7 @@
       <w:pPr>
         <w:numPr>
           <w:ilvl w:val="0"/>
-          <w:numId w:val="1292"/>
+          <w:numId w:val="1296"/>
         </w:numPr>
       </w:pPr>
       <w:r>
@@ -9845,7 +10204,7 @@
       <w:pPr>
         <w:numPr>
           <w:ilvl w:val="0"/>
-          <w:numId w:val="1293"/>
+          <w:numId w:val="1297"/>
         </w:numPr>
       </w:pPr>
       <w:r>
@@ -9856,7 +10215,7 @@
       <w:pPr>
         <w:numPr>
           <w:ilvl w:val="0"/>
-          <w:numId w:val="1294"/>
+          <w:numId w:val="1298"/>
         </w:numPr>
       </w:pPr>
       <w:r>
@@ -9867,7 +10226,7 @@
       <w:pPr>
         <w:numPr>
           <w:ilvl w:val="0"/>
-          <w:numId w:val="1295"/>
+          <w:numId w:val="1299"/>
         </w:numPr>
       </w:pPr>
       <w:r>
@@ -9878,7 +10237,7 @@
       <w:pPr>
         <w:numPr>
           <w:ilvl w:val="0"/>
-          <w:numId w:val="1296"/>
+          <w:numId w:val="1300"/>
         </w:numPr>
       </w:pPr>
       <w:r>
@@ -9984,7 +10343,7 @@
       <w:pPr>
         <w:numPr>
           <w:ilvl w:val="0"/>
-          <w:numId w:val="1297"/>
+          <w:numId w:val="1301"/>
         </w:numPr>
       </w:pPr>
       <w:r>
@@ -10008,7 +10367,7 @@
       <w:pPr>
         <w:numPr>
           <w:ilvl w:val="0"/>
-          <w:numId w:val="1298"/>
+          <w:numId w:val="1302"/>
         </w:numPr>
       </w:pPr>
       <w:r>
@@ -10019,7 +10378,7 @@
       <w:pPr>
         <w:numPr>
           <w:ilvl w:val="0"/>
-          <w:numId w:val="1299"/>
+          <w:numId w:val="1303"/>
         </w:numPr>
       </w:pPr>
       <w:r>
@@ -10030,7 +10389,7 @@
       <w:pPr>
         <w:numPr>
           <w:ilvl w:val="0"/>
-          <w:numId w:val="1300"/>
+          <w:numId w:val="1304"/>
         </w:numPr>
       </w:pPr>
       <w:r>
@@ -10041,7 +10400,7 @@
       <w:pPr>
         <w:numPr>
           <w:ilvl w:val="0"/>
-          <w:numId w:val="1301"/>
+          <w:numId w:val="1305"/>
         </w:numPr>
       </w:pPr>
       <w:r>
@@ -10052,7 +10411,7 @@
       <w:pPr>
         <w:numPr>
           <w:ilvl w:val="0"/>
-          <w:numId w:val="1302"/>
+          <w:numId w:val="1306"/>
         </w:numPr>
       </w:pPr>
       <w:r>
@@ -10063,7 +10422,7 @@
       <w:pPr>
         <w:numPr>
           <w:ilvl w:val="0"/>
-          <w:numId w:val="1303"/>
+          <w:numId w:val="1307"/>
         </w:numPr>
       </w:pPr>
       <w:r>
@@ -10074,7 +10433,7 @@
       <w:pPr>
         <w:numPr>
           <w:ilvl w:val="0"/>
-          <w:numId w:val="1304"/>
+          <w:numId w:val="1308"/>
         </w:numPr>
       </w:pPr>
       <w:r>
@@ -10180,7 +10539,7 @@
       <w:pPr>
         <w:numPr>
           <w:ilvl w:val="0"/>
-          <w:numId w:val="1305"/>
+          <w:numId w:val="1309"/>
         </w:numPr>
       </w:pPr>
       <w:r>
@@ -10191,7 +10550,7 @@
       <w:pPr>
         <w:numPr>
           <w:ilvl w:val="0"/>
-          <w:numId w:val="1306"/>
+          <w:numId w:val="1310"/>
         </w:numPr>
       </w:pPr>
       <w:r>
@@ -10218,7 +10577,7 @@
       <w:pPr>
         <w:numPr>
           <w:ilvl w:val="0"/>
-          <w:numId w:val="1307"/>
+          <w:numId w:val="1311"/>
         </w:numPr>
       </w:pPr>
       <w:r>
@@ -10229,7 +10588,7 @@
       <w:pPr>
         <w:numPr>
           <w:ilvl w:val="0"/>
-          <w:numId w:val="1308"/>
+          <w:numId w:val="1312"/>
         </w:numPr>
       </w:pPr>
       <w:r>
@@ -10240,7 +10599,7 @@
       <w:pPr>
         <w:numPr>
           <w:ilvl w:val="0"/>
-          <w:numId w:val="1309"/>
+          <w:numId w:val="1313"/>
         </w:numPr>
       </w:pPr>
       <w:r>
@@ -10251,7 +10610,7 @@
       <w:pPr>
         <w:numPr>
           <w:ilvl w:val="0"/>
-          <w:numId w:val="1310"/>
+          <w:numId w:val="1314"/>
         </w:numPr>
       </w:pPr>
       <w:r>
@@ -10262,7 +10621,7 @@
       <w:pPr>
         <w:numPr>
           <w:ilvl w:val="0"/>
-          <w:numId w:val="1311"/>
+          <w:numId w:val="1315"/>
         </w:numPr>
       </w:pPr>
       <w:r>
@@ -12031,6 +12390,18 @@
     <w:abstractNumId w:val="992"/>
   </w:num>
   <w:num w:numId="1311">
+    <w:abstractNumId w:val="992"/>
+  </w:num>
+  <w:num w:numId="1312">
+    <w:abstractNumId w:val="992"/>
+  </w:num>
+  <w:num w:numId="1313">
+    <w:abstractNumId w:val="992"/>
+  </w:num>
+  <w:num w:numId="1314">
+    <w:abstractNumId w:val="992"/>
+  </w:num>
+  <w:num w:numId="1315">
     <w:abstractNumId w:val="992"/>
   </w:num>
 </w:numbering>

</xml_diff>